<commit_message>
docs: improve Turkish reading copy readability
</commit_message>
<xml_diff>
--- a/manuscript/thesis_34_TR.docx
+++ b/manuscript/thesis_34_TR.docx
@@ -627,7 +627,7 @@
         <w:suppressAutoHyphens w:val="true"/>
       </w:pPr>
       <w:r>
-        <w:t>Test edilen kontrollü sentetik HFMM ortamında, PPO politikası sigma_hat sinyalini zaten gözlemlerken açık kategorik volatilite-rejimi etiketleri güvenilir bir ek performans katkısı sağlamamaktadır. Sonuçlar sinyal fazlalığı (signal redundancy) yorumu ile tutarlıdır.</w:t>
+        <w:t>Test edilen kontrollü sentetik HFMM ortamında, PPO politikası sigma_hat sinyalini zaten gözlemlerken açık kategorik volatilite-rejimi etiketleri tutarlı ve güçlü bir ek fayda sağlamamaktadır. Sonuçlar sinyal fazlalığı (signal redundancy) yorumu ile tutarlıdır.</w:t>
       </w:r>
     </w:p>
     <w:p>
@@ -660,7 +660,7 @@
         <w:suppressAutoHyphens w:val="true"/>
       </w:pPr>
       <w:r>
-        <w:t>Test edilen kontrollü sentetik HFMM ortamında, PPO politikası sigma_hat sinyalini zaten gözlemlerken açık kategorik volatilite-rejimi etiketleri güvenilir bir ek performans katkısı sağlamamaktadır. Sonuçlar sinyal fazlalığı (signal redundancy) yorumu ile tutarlıdır. Kanıt, kanonik dondurulmuş deneylerden gelir: örneklem dışı (OOS) değerlendirme, dedektör seçimine karşı sağlamlık, oracle-etiket ablasyonları, rejime koşullu ödül şekillendirme, hafif model yanlış-belirlenimi ve sinyalin bilgi değerini test eden tarama. Beş-varyant ablasyonda sigma_only en yüksek ortalama Sharpe-like değerine ulaşmıştır (0.753); oracle_full ise yalnızca sigma_hat'e göre istatistiksel olarak anlamlı ya da pratik olarak anlamlı bir iyileşme sağlamamıştır (eşleştirilmiş t-testi p = 0.115; TOST +/-0.10 p = 0.00067; 90% CI [-0.001, +0.063]). Bu nedenle en güçlü yorum koşullu ve sentetik piyasa ile sınırlıdır: açık rejim etiketi çoğunlukla sürekli sinyalde zaten bulunan volatilite bilgisini yeniden paketlemektedir. Rapor gerçek işlem/production ortamında kullanım iddiası taşımaz ve PPO'nun iç mekanizmasını kanıtladığını iddia etmez.</w:t>
+        <w:t>Test edilen kontrollü sentetik HFMM ortamında, PPO politikası sigma_hat sinyalini zaten gözlemlerken açık kategorik volatilite-rejimi etiketleri tutarlı ve güçlü bir ek fayda sağlamamaktadır. Sonuçlar sinyal fazlalığı (signal redundancy) yorumu ile tutarlıdır. Kanıt, kanonik dondurulmuş deneylerden gelir: örneklem dışı (OOS) değerlendirme, dedektör seçimine karşı sağlamlık, oracle-etiket ablasyonları, rejime koşullu ödül şekillendirme, hafif model yanlış tanımlaması ve sinyalin bilgi değerini test eden tarama. Beş-varyant ablasyonda sigma_only en yüksek ortalama Sharpe-like değerine ulaşmıştır (0.753); oracle_full ise yalnızca sigma_hat'e göre istatistiksel olarak anlamlı ya da pratik olarak anlamlı bir iyileşme sağlamamıştır (eşleştirilmiş t-testi p = 0.115; TOST +/-0.10 p = 0.00067; 90% CI [-0.001, +0.063]). Bu nedenle en güçlü yorum koşullu ve kontrollü sentetik piyasa ortamı ile sınırlıdır: açık rejim etiketi çoğunlukla sürekli sinyalde zaten bulunan volatilite bilgisini yeniden paketlemektedir. Rapor gerçek işlem/production ortamında kullanım iddiası taşımaz ve PPO'nun iç mekanizmasını kanıtladığını iddia etmez.</w:t>
       </w:r>
     </w:p>
     <w:p>
@@ -2480,7 +2480,7 @@
         <w:suppressAutoHyphens w:val="true"/>
       </w:pPr>
       <w:r>
-        <w:t>Bu tezle ilgili literatür dört bağlantılı alanda toplanır: klasik envanter-duyarlı piyasa yapıcılığı, pekiştirmeli öğrenme ile piyasa yapıcılığı, volatilite rejimleri ve piyasa koşullarının zamanla değişmesi (non-stationarity), ayrıca küçük ya da pratik olarak ihmal edilebilir farkların istatistiksel yorumu. Bu incelemenin amacı yeni bir analitik kotasyon kuralı ya da yeni bir pekiştirmeli öğrenme algoritması iddia etmek değildir. Amaç, daha dar bir gözlem/sinyal tasarımı sorusunu yerleşik piyasa yapıcılığı literatürü içinde konumlandırmaktır.</w:t>
+        <w:t>Bu tezle ilgili literatür dört ana literatür başlığı altında toplanır: klasik envanter-duyarlı piyasa yapıcılığı, pekiştirmeli öğrenme ile piyasa yapıcılığı, volatilite rejimleri ve piyasa koşullarının zamanla değişmesi (non-stationarity), ayrıca küçük ya da pratik olarak ihmal edilebilir farkların istatistiksel yorumu. Bu incelemenin amacı yeni bir analitik kotasyon kuralı ya da yeni bir pekiştirmeli öğrenme algoritması iddia etmek değildir. Amaç, daha dar bir gözlem/sinyal tasarımı sorusunu yerleşik piyasa yapıcılığı literatürü içinde konumlandırmaktır.</w:t>
       </w:r>
     </w:p>
     <w:p>
@@ -2496,7 +2496,7 @@
         <w:suppressAutoHyphens w:val="true"/>
       </w:pPr>
       <w:r>
-        <w:t>Bu analitik literatür tez tasarımını iki doğrudan yolla motive eder: envanter, volatilite, kotasyon mesafesi ve dolum yoğunluğunun neden merkezi durum değişkenleri olduğunu açıklar ve öğrenmeyen karşılaştırıcı olarak kullanılan Avellaneda-Stoikov referans modelini sağlar. Fodra ve Labadie'nin (2012, 2013) ilgili ön baskıları envanter kısıtlı ve durum-bağımlı piyasa yapıcılığı modelleri için yararlı ek bağlam sunar; ancak ön baskı oldukları için ihtiyatla ele alınır. Tez yeni bir kapalı-form kotasyon kuralı türetmeye çalışmaz; simülasyon ve benchmark tasarımını çerçevelemek için analitik geleneği kullanır.</w:t>
+        <w:t>Bu analitik literatür tez tasarımını iki doğrudan yolla motive eder: envanter, volatilite, kotasyon mesafesi ve dolum yoğunluğunun neden merkezi durum değişkenleri olduğunu açıklar ve öğrenmeyen bir karşılaştırma standardı olarak kullanılan Avellaneda-Stoikov referans modelini sağlar. Fodra ve Labadie'nin (2012, 2013) ilgili ön baskıları envanter kısıtlı ve durum-bağımlı piyasa yapıcılığı modelleri için yararlı ek bağlam sunar; ancak ön baskı oldukları için ihtiyatla ele alınır. Tez yeni bir kapalı-form kotasyon kuralı türetmeye çalışmaz; simülasyon ve benchmark tasarımını çerçevelemek için analitik geleneği kullanır.</w:t>
       </w:r>
     </w:p>
     <w:p>
@@ -2504,7 +2504,7 @@
         <w:suppressAutoHyphens w:val="true"/>
       </w:pPr>
       <w:r>
-        <w:t>İkinci alan, kapalı-form kuralların yerine öğrenilmiş politikaları koyar. Spooner vd. (2018), pekiştirmeli öğrenmenin simüle edilmiş bir limit emir defteri ortamında piyasa yapıcılığı davranışını öğrenebildiğini gösterir ve ödül tasarımı ile envanter kontrolünün neden önemli olduğunu ortaya koyar. Spooner ve Savani (2020), tartışmayı sistematik olarak değiştirilen piyasa koşulları altında sağlamlığa doğru genişletir. Bu çalışmalar, öğrenilmiş kotasyon politikaları için simülatör tabanlı değerlendirmenin kullanımını destekler; aynı zamanda piyasa yapıcılığı performansının eğitim ve değerlendirme bölümlerini üretmek için kullanılan varsayımlara duyarlı olabileceğini gösterir.</w:t>
+        <w:t>İkinci başlık, kapalı-form kuralların yerine öğrenilmiş politikaları koyar. Spooner vd. (2018), pekiştirmeli öğrenmenin simüle edilmiş bir limit emir defteri ortamında piyasa yapıcılığı davranışını öğrenebildiğini gösterir ve ödül tasarımı ile envanter kontrolünün neden önemli olduğunu ortaya koyar. Spooner ve Savani (2020), tartışmayı adversarial, yani bilinçli olarak zorlaştırılmış piyasa koşulları altında sağlamlığa doğru genişletir. Bu çalışmalar, öğrenilmiş kotasyon politikaları için simülatör tabanlı değerlendirmenin kullanımını destekler; aynı zamanda piyasa yapıcılığı performansının eğitim ve değerlendirme bölümlerini üretmek için kullanılan varsayımlara duyarlı olabileceğini gösterir.</w:t>
       </w:r>
     </w:p>
     <w:p>
@@ -2536,7 +2536,7 @@
         <w:suppressAutoHyphens w:val="true"/>
       </w:pPr>
       <w:r>
-        <w:t>Son olarak, ampirik yorum dikkat gerektirir; çünkü tez genel olarak volatilite etkilerinin varlığını değil, artı bir sinyali değerlendirir. Lakens (2017) ve Lakens, Scheel ve Isager (2018), yalnızca anlamlı olmayan bir farkı, önceden belirlenmiş pratik bir sınıra göre küçük bir farka ilişkin kanıttan ayırmanın yolu olarak eşdeğerlik testini motive eder. Bu nedenle TOST çerçevesi sonraki istatistik bölümünün arka planı olarak kullanılır; tek başına etiketlerin bilgi içermediğini kanıtlamaz.</w:t>
+        <w:t>Son olarak, ampirik yorum dikkat gerektirir; çünkü tez genel olarak volatilite etkilerinin varlığını değil, ek bir sinyalin ilave bilgi değerini değerlendirir. Lakens (2017) ve Lakens, Scheel ve Isager (2018), yalnızca anlamlı olmayan bir farkı, önceden belirlenmiş pratik bir sınıra göre küçük kalan bir farka ilişkin kanıttan ayırmanın yolu olarak eşdeğerlik testini motive eder. Bu nedenle TOST çerçevesi sonraki istatistik bölümünün arka planı olarak kullanılır; tek başına etiketlerin bilgi içermediğini kanıtlamaz.</w:t>
       </w:r>
     </w:p>
     <w:p>
@@ -2590,7 +2590,7 @@
         <w:suppressAutoHyphens w:val="true"/>
       </w:pPr>
       <w:r>
-        <w:t>Yorumu sınırlandıran dedektör seçimi, ödül şekillendirme, yanlış-belirlenim ve sinyal bilgi-değeri kontrolleri.</w:t>
+        <w:t>Yorumu sınırlandıran dedektör seçimi, ödül şekillendirme, model yanlış tanımlaması ve sinyal bilgi-değeri kontrolleri.</w:t>
       </w:r>
     </w:p>
     <w:p>
@@ -2838,7 +2838,7 @@
         <w:suppressAutoHyphens w:val="true"/>
       </w:pPr>
       <w:r>
-        <w:t>Figure 2.1. Açıklayıcı sentetik HFMM ortam patikası. Üst panel üretilen orta fiyat patikasını gösterir. Orta panel, politikanın gözlemlediği kayan gerçekleşmiş-volatilite sinyalini gerçek rejime bağlı volatilite düzeyiyle karşılaştırır. Alt panel gizil Markov volatilite-rejimi dizisini gösterir. Kesikli dikey çizgi, örneklem dışı değerlendirme için kullanılan kronolojik 70/30 eğitim-test ayrımını işaretler. Bu şekil scripts/figures/gen_synthetic_environment_figure.py tarafından üretilmiştir ve yeniden üretilmiş bir performans artefaktı değil, metodoloji açıklamasıdır.</w:t>
+        <w:t>Şekil 2.1. Açıklayıcı sentetik HFMM ortam patikası. Üst panel üretilen orta fiyat patikasını gösterir. Orta panel, politikanın gözlemlediği kayan gerçekleşmiş-volatilite sinyalini gerçek rejime bağlı volatilite düzeyiyle karşılaştırır. Alt panel gizil Markov volatilite-rejimi dizisini gösterir. Kesikli dikey çizgi, örneklem dışı değerlendirme için kullanılan kronolojik 70/30 eğitim-test ayrımını işaretler. Bu şekil scripts/figures/gen_synthetic_environment_figure.py tarafından üretilmiştir ve yeniden üretilmiş bir performans artefaktı değil, metodoloji açıklamasıdır.</w:t>
       </w:r>
     </w:p>
     <w:p>
@@ -3082,7 +3082,7 @@
         <w:suppressAutoHyphens w:val="true"/>
       </w:pPr>
       <w:r>
-        <w:t>2.7 Avellaneda-Stoikov Baz Çizgisi</w:t>
+        <w:t>2.7 Avellaneda-Stoikov Referans Modeli</w:t>
       </w:r>
     </w:p>
     <w:p>
@@ -3878,7 +3878,7 @@
               <w:rPr>
                 <w:sz w:val="18"/>
               </w:rPr>
-              <w:t>Yalnızca-etiket dayanak varyantları.</w:t>
+              <w:t>Sadece etiket kullanan kontrol varyantları.</w:t>
             </w:r>
           </w:p>
         </w:tc>
@@ -3895,7 +3895,7 @@
         <w:suppressAutoHyphens w:val="true"/>
       </w:pPr>
       <w:r>
-        <w:t>3.3 Bilgi-Tasarımı Sorusu</w:t>
+        <w:t>3.3 Gözlem/Sinyal Tasarımı Sorusu</w:t>
       </w:r>
     </w:p>
     <w:p>
@@ -3903,7 +3903,7 @@
         <w:suppressAutoHyphens w:val="true"/>
       </w:pPr>
       <w:r>
-        <w:t>Test edilen kontrollü sentetik HFMM ortamında, PPO politikası sigma_hat sinyalini zaten gözlemlerken açık kategorik volatilite-rejimi etiketleri güvenilir bir ek performans katkısı sağlamamaktadır. Sonuçlar sinyal fazlalığı (signal redundancy) yorumu ile tutarlıdır.</w:t>
+        <w:t>Test edilen kontrollü sentetik HFMM ortamında, PPO politikası sigma_hat sinyalini zaten gözlemlerken açık kategorik volatilite-rejimi etiketleri tutarlı ve güçlü bir ek fayda sağlamamaktadır. Sonuçlar sinyal fazlalığı (signal redundancy) yorumu ile tutarlıdır.</w:t>
       </w:r>
     </w:p>
     <w:p>
@@ -3980,7 +3980,7 @@
         <w:suppressAutoHyphens w:val="true"/>
       </w:pPr>
       <w:r>
-        <w:t>Eğitim katmanı PPO politikalarını eğitir; ana değerlendirme katmanı stratejileri ve ablasyonları karşılaştırır; sinyal bilgi-değeri katmanı ise sigma_hat bozuldukça rejim etiketlerinin değer kazanıp kazanmadığını test eder. Sabit-spread ve AS referans stratejileri öğrenmeyen karşılaştırıcılar sağlar.</w:t>
+        <w:t>Eğitim katmanı PPO politikalarını eğitir; ana değerlendirme katmanı stratejileri ve ablasyonları karşılaştırır; sinyalin bilgi değerini test eden katman ise sigma_hat bozuldukça rejim etiketlerinin değer kazanıp kazanmadığını inceler. Sabit-spread ve AS referans stratejileri, öğrenmeyen karşılaştırma standartları olarak kullanılır.</w:t>
       </w:r>
     </w:p>
     <w:p>
@@ -3997,7 +3997,7 @@
         <w:suppressAutoHyphens w:val="true"/>
       </w:pPr>
       <w:r>
-        <w:t>Değerlendirme CSV metrikleri, figürler ve özetler yazar. thesis_34 uyarlaması mevcut figürleri belgeye ekler ve dondurulmuş sayısal kanıtı alıntılar; korunan kanıt artefaktlarını yeniden üretmez.</w:t>
+        <w:t>Değerlendirme katmanı CSV metriklerini, figürleri ve özetleri üretir. thesis_34 uyarlaması mevcut figürleri belgeye ekler ve dondurulmuş sayısal kanıtı kullanır; korunan kanıt artefaktlarını yeniden üretmez.</w:t>
       </w:r>
     </w:p>
     <w:p>
@@ -4016,7 +4016,7 @@
         <w:suppressAutoHyphens w:val="true"/>
       </w:pPr>
       <w:r>
-        <w:t>Figure 4.1 kanıt boru hattını metodolojik düzeyde özetler. Sentetik bir patika gizil volatilite rejimini ve orta fiyat dizisini üretir; kayan gerçekleşmiş volatilite ve dedektör etiketleri gözlemlenen sinyalleri oluşturur; Gymnasium ortamı bu sinyalleri, envanteri, zamanı, kotasyonları ve dolumları sıralı gözlemlere ve ödüllere dönüştürür; ardından PPO varyantları ve analitik baz çizgileri elde tutulan örneklem dışı metrikler üzerinde değerlendirilir. Şekil yalnızca iş akışını açıklığa kavuşturmak için eklenmiştir ve yeniden üretilmiş bir performans artefaktı değildir.</w:t>
+        <w:t>Şekil 4.1 kanıt üretim hattını metodolojik düzeyde özetler. Sentetik bir patika gizil volatilite rejimini ve orta fiyat dizisini üretir; kayan gerçekleşmiş volatilite ve dedektör etiketleri gözlemlenen sinyalleri oluşturur; Gymnasium ortamı bu sinyalleri, envanteri, zamanı, kotasyonları ve dolumları sıralı gözlemlere ve ödüllere dönüştürür. Ardından PPO varyantları ve analitik referans modelleri, elde tutulan örneklem dışı metrikler üzerinde değerlendirilir. Şekil yalnızca iş akışını açıklığa kavuşturmak için eklenmiştir ve yeniden üretilmiş bir performans artefaktı değildir.</w:t>
       </w:r>
     </w:p>
     <w:p>
@@ -4069,7 +4069,7 @@
         <w:suppressAutoHyphens w:val="true"/>
       </w:pPr>
       <w:r>
-        <w:t>Figure 4.1. Yalnızca metodolojiye yönelik HFMM değerlendirme boru hattı. Sentetik piyasa patikaları sigma_hat ve regime_hat sinyallerini üretir; bu sinyaller Gymnasium ortamını, PPO varyantlarını, baz çizgilerini ve örneklem dışı metrikleri besler. scripts/figures/gen_pipeline_architecture_figure.py tarafından üretilmiştir; bu gösterim performans kanıtı değildir.</w:t>
+        <w:t>Şekil 4.1. Yalnızca metodolojiye yönelik HFMM değerlendirme hattı. Sentetik piyasa patikaları sigma_hat ve regime_hat sinyallerini üretir; bu sinyaller Gymnasium ortamını, PPO varyantlarını, referans stratejileri ve örneklem dışı metrikleri besler. scripts/figures/gen_pipeline_architecture_figure.py tarafından üretilmiştir; bu gösterim performans kanıtı değildir.</w:t>
       </w:r>
     </w:p>
     <w:p>
@@ -4560,7 +4560,7 @@
           <w:rFonts w:ascii="Consolas" w:hAnsi="Consolas" w:eastAsia="Consolas"/>
           <w:sz w:val="18"/>
         </w:rPr>
-        <w:t>{full, noisy, lagged, coarsened, none} içindeki her sinyal bozulması koşulu için:</w:t>
+        <w:t>{full, noisy, lagged, coarsened, none} içindeki her bozulmuş sinyal senaryosu için:</w:t>
       </w:r>
     </w:p>
     <w:p>
@@ -5009,7 +5009,7 @@
               <w:rPr>
                 <w:sz w:val="18"/>
               </w:rPr>
-              <w:t>WP6 süpürmesi</w:t>
+              <w:t>WP6 taraması</w:t>
             </w:r>
           </w:p>
         </w:tc>
@@ -5057,7 +5057,7 @@
         <w:suppressAutoHyphens w:val="true"/>
       </w:pPr>
       <w:r>
-        <w:t>Simülasyon ve deterministik değerlendirme ortam adımı sayısına göre doğrusaldır. PPO eğitim maliyeti yaklaşık olarak toplam zaman adımı sayısına, politika ağının ileri/geri geçişlerine ve seed-varyant hücrelerinin sayısına göre doğrusaldır. WP6 tam süpürmesi pahalıdır; çünkü koşulları, varyantları ve seed değerlerini çarpar. Bu nedenle çıktıları dondurulmuş kanıt olarak ele alınır.</w:t>
+        <w:t>Simülasyon ve deterministik değerlendirme ortam adımı sayısına göre doğrusaldır. PPO eğitim maliyeti yaklaşık olarak toplam zaman adımı sayısına, politika ağının ileri/geri geçişlerine ve seed-varyant hücrelerinin sayısına göre doğrusaldır. WP6 tam taraması pahalıdır; çünkü koşulları, varyantları ve seed değerlerini çarpar. Bu nedenle çıktıları dondurulmuş kanıt olarak ele alınır.</w:t>
       </w:r>
     </w:p>
     <w:p>
@@ -6026,7 +6026,7 @@
               <w:rPr>
                 <w:sz w:val="18"/>
               </w:rPr>
-              <w:t>0.01 for full WP5/WP6 runs</w:t>
+              <w:t>tam WP5/WP6 çalışmaları için 0.01</w:t>
             </w:r>
           </w:p>
         </w:tc>
@@ -6079,7 +6079,7 @@
         <w:suppressAutoHyphens w:val="true"/>
       </w:pPr>
       <w:r>
-        <w:t>thesis_34 uyarlaması dondurulmuş performans sonuçlarını yeniden kullanır. PPO eğitimini, WP5/WP6 deneylerini, dedektör seçimine karşı sağlamlık analizlerini, ablasyonları, yanlış-belirlenim kontrollerini, korunan CSV üretimini ya da dondurulmuş performans şekillerini yeniden çalıştırmaz. Yeni üretilen tek görseller, `scripts/figures/gen_synthetic_environment_figure.py` ve `scripts/figures/gen_pipeline_architecture_figure.py` tarafından üretilen yalnızca metodolojiye yönelik gösterimlerdir.</w:t>
+        <w:t>thesis_34 uyarlaması dondurulmuş performans sonuçlarını yeniden kullanır. PPO eğitimini, WP5/WP6 deneylerini, dedektör seçimine karşı sağlamlık analizlerini, ablasyonları, model yanlış tanımlaması kontrollerini, korunan CSV üretimini ya da dondurulmuş performans şekillerini yeniden çalıştırmaz. Yeni üretilen tek görseller, `scripts/figures/gen_synthetic_environment_figure.py` ve `scripts/figures/gen_pipeline_architecture_figure.py` tarafından üretilen yalnızca metodolojiye yönelik gösterimlerdir.</w:t>
       </w:r>
     </w:p>
     <w:p>
@@ -6737,7 +6737,7 @@
         <w:suppressAutoHyphens w:val="true"/>
       </w:pPr>
       <w:r>
-        <w:t>AS uygulaması, kapsamlı biçimde optimize edilmiş bir işlem sistemi olarak değil, kanonik analitik envanter-duyarlı karşılaştırıcı olarak kullanılır. PPO-AS karşılaştırması öğrenilmiş kotasyon ve envanter kontrolü için bir referans noktası kurar; ancak tezin merkezi iddiası sigma_hat, tahmini etiketler ve oracle etiketler arasındaki PPO-içi sinyal-tasarımı karşılaştırmasıdır.</w:t>
+        <w:t>AS uygulaması, kapsamlı biçimde optimize edilmiş bir işlem sistemi olarak değil, kanonik, analitik ve envanter-duyarlı bir karşılaştırma modeli olarak kullanılır. PPO-AS karşılaştırması öğrenilmiş kotasyon ve envanter kontrolü için bir referans noktası kurar; ancak tezin merkezi iddiası sigma_hat, tahmini etiketler ve oracle etiketler arasındaki PPO-içi sinyal-tasarımı karşılaştırmasıdır.</w:t>
       </w:r>
     </w:p>
     <w:p>
@@ -6790,7 +6790,7 @@
         <w:suppressAutoHyphens w:val="true"/>
       </w:pPr>
       <w:r>
-        <w:t>Figure 8.1. Deney 1 ana OOS sonuçları: PPO varyantları risk-ayarlı performansta naive ve AS stratejilerine baskındır; AS ise çok daha büyük envanter kuyruk riski taşır.</w:t>
+        <w:t>Şekil 8.1. Deney 1 ana OOS sonuçları: PPO varyantları risk-ayarlı performansta naive ve AS stratejilerine baskındır; AS ise çok daha büyük envanter kuyruk riski taşır.</w:t>
       </w:r>
     </w:p>
     <w:p>
@@ -6843,7 +6843,7 @@
         <w:suppressAutoHyphens w:val="true"/>
       </w:pPr>
       <w:r>
-        <w:t>Figure 8.2. Seed-eşleştirilmiş PPO-aware ve PPO-blind karşılaştırması: tahmini rejim kanalı sağlam bir Sharpe-like avantajı yaratmaz.</w:t>
+        <w:t>Şekil 8.2. Seed-eşleştirilmiş PPO-aware ve PPO-blind karşılaştırması: tahmini rejim kanalı sağlam bir Sharpe-like avantajı yaratmaz.</w:t>
       </w:r>
     </w:p>
     <w:p>
@@ -7667,7 +7667,7 @@
         <w:suppressAutoHyphens w:val="true"/>
       </w:pPr>
       <w:r>
-        <w:t>Figure 8.3. Beş-varyant ablasyon özeti: sigma_only en güçlü ortalama Sharpe-like varyantıdır ve kategorik etiket eklemek onu iyileştirmez.</w:t>
+        <w:t>Şekil 8.3. Beş-varyant ablasyon özeti: sigma_only en güçlü ortalama Sharpe-like varyantıdır ve kategorik etiket eklemek onu iyileştirmez.</w:t>
       </w:r>
     </w:p>
     <w:p>
@@ -7720,7 +7720,7 @@
         <w:suppressAutoHyphens w:val="true"/>
       </w:pPr>
       <w:r>
-        <w:t>Figure 8.4. Oracle-etiket seed-eşleştirilmiş karşılaştırması: gerçek rejim etiketleri bile yalnızca sigma_hat'e göre güvenilir bir iyileşme sağlamaz.</w:t>
+        <w:t>Şekil 8.4. Oracle-etiket seed-eşleştirilmiş karşılaştırması: gerçek rejim etiketleri bile yalnızca sigma_hat'e göre güvenilir bir iyileşme sağlamaz.</w:t>
       </w:r>
     </w:p>
     <w:p>
@@ -9070,7 +9070,7 @@
               <w:rPr>
                 <w:sz w:val="18"/>
               </w:rPr>
-              <w:t>Detector choice does not explain the result</w:t>
+              <w:t>Dedektör seçimi sonucu açıklamaz</w:t>
             </w:r>
           </w:p>
         </w:tc>
@@ -9170,7 +9170,7 @@
         <w:suppressAutoHyphens w:val="true"/>
       </w:pPr>
       <w:r>
-        <w:t>Figure 8.5. Dedektör sağlamlığı: rv_baseline, rv_dwell ve HMM'nin hiçbiri güvenilir bir rejim-farkında PPO avantajı yaratmaz.</w:t>
+        <w:t>Şekil 8.5. Dedektör sağlamlığı: rv_baseline, rv_dwell ve HMM'nin hiçbiri güvenilir bir rejim-farkında PPO avantajı yaratmaz.</w:t>
       </w:r>
     </w:p>
     <w:p>
@@ -9187,7 +9187,7 @@
         <w:suppressAutoHyphens w:val="true"/>
       </w:pPr>
       <w:r>
-        <w:t>Rejime koşullu eta çalışması, ödül yüksek-volatilite envanterini daha güçlü cezalandırdığında açık etiketlerin yararlı hâle gelip gelmediğini test eder. sigma_only, Sharpe-like performansta combined varyantını hâlâ geçer (p = 0.0016). Hafif rejime bağlı yürütme yanlış-belirlenimi altında sigma_only ve oracle_full, raporlanan TOST sınırı altında istatistiksel olarak ayırt edilemez ve pratik olarak eşdeğer kalır.</w:t>
+        <w:t>Rejime koşullu eta çalışması, ödül yüksek-volatilite envanterini daha güçlü cezalandırdığında açık etiketlerin yararlı hâle gelip gelmediğini test eder. sigma_only, Sharpe-like performansta combined varyantını hâlâ geçer (p = 0.0016). Hafif rejime bağlı yürütme model yanlış tanımlaması altında sigma_only ve oracle_full, raporlanan TOST sınırı altında istatistiksel olarak ayırt edilemez ve pratik olarak eşdeğer kalır.</w:t>
       </w:r>
     </w:p>
     <w:p>
@@ -9248,7 +9248,7 @@
         <w:suppressAutoHyphens w:val="true"/>
       </w:pPr>
       <w:r>
-        <w:t>Figure 8.6. Rejime koşullu eta özeti: ödül kanalını rejime göre değiştirmek hâlâ sigma_only varyantını combined karşısında destekler.</w:t>
+        <w:t>Şekil 8.6. Rejime koşullu eta özeti: ödül kanalını rejime göre değiştirmek hâlâ sigma_only varyantını combined karşısında destekler.</w:t>
       </w:r>
     </w:p>
     <w:p>
@@ -9301,7 +9301,7 @@
         <w:suppressAutoHyphens w:val="true"/>
       </w:pPr>
       <w:r>
-        <w:t>Figure 8.7. Hafif model yanlış-belirlenimi özeti: sigma_only ve oracle_full rejime bağlı yürütme parametreleri altında yakın kalır.</w:t>
+        <w:t>Şekil 8.7. Hafif model yanlış tanımlaması özeti: sigma_only ve oracle_full rejime bağlı yürütme parametreleri altında yakın kalır.</w:t>
       </w:r>
     </w:p>
     <w:p>
@@ -10208,7 +10208,7 @@
         <w:suppressAutoHyphens w:val="true"/>
       </w:pPr>
       <w:r>
-        <w:t>Sinyal bilgi-değeri taramasına ait şekiller, yeni bir mekanizma kanıtı değil, ana bulgunun daha ince bir okuması olarak değerlendirilmelidir: test edilen sigma_hat bozulması patikasının bir rejim-etiketi avantajı ortaya çıkarmadığını gösterirler.</w:t>
+        <w:t>Sinyal Bilgi-Değeri Taraması şekilleri, yeni bir mekanizma kanıtı değil, ana bulgunun daha incelikli bir okuması olarak değerlendirilmelidir: test edilen sigma_hat bozulması patikasında rejim etiketinin ayrı bir avantajı görünmemektedir.</w:t>
       </w:r>
     </w:p>
     <w:p>
@@ -10261,7 +10261,7 @@
         <w:suppressAutoHyphens w:val="true"/>
       </w:pPr>
       <w:r>
-        <w:t>Figure 8.8. Deney 5 monotonik-fark grafiği: sigma_only ile combined arasındaki farkın beklenen daralması test edilen kalibrasyon bandında görünmez.</w:t>
+        <w:t>Şekil 8.8. Deney 5 monotonik-fark grafiği: sigma_only ile combined arasındaki farkın beklenen daralması test edilen kalibrasyon bandında görünmez.</w:t>
       </w:r>
     </w:p>
     <w:p>
@@ -10279,7 +10279,7 @@
         <w:suppressAutoHyphens w:val="true"/>
       </w:pPr>
       <w:r>
-        <w:t>En belirgin performans düşüşü gecikmeli sinyal senaryosunda görünür; burada combined, sigma_only değerinin belirgin biçimde altındadır (ortalama fark yaklaşık -0.101; Cohen's dz yaklaşık -0.91). Bu, güncel olmayan kategorik rejim sinyalinin kontrolle ilgili volatilite bilgisi yerine gecikmiş ve kaba durum bilgisi eklediğinde zararlı olabileceğini düşündürür.</w:t>
+        <w:t>En belirgin performans düşüşü örüntüsü gecikmeli sinyal senaryosunda görünür; burada combined, sigma_only değerinin belirgin biçimde altındadır (ortalama fark yaklaşık -0.101; Cohen's dz yaklaşık -0.91). Bu, gecikmeli ve kaba bir kategorik sinyalin kontrolle ilgili volatilite bilgisi yerine gecikmiş/kaba durum bilgisi eklediğinde zararlı olabileceğini düşündürür.</w:t>
       </w:r>
     </w:p>
     <w:p>
@@ -10340,7 +10340,7 @@
         <w:suppressAutoHyphens w:val="true"/>
       </w:pPr>
       <w:r>
-        <w:t>Figure 8.9. Deney 5 seed-eşleştirilmiş combined ve sigma_only karşılaştırması: combined bilgilendirici koşullarda yönsel olarak sigma_only altındadır.</w:t>
+        <w:t>Şekil 8.9. Deney 5 seed-eşleştirilmiş combined ve sigma_only karşılaştırması: combined bilgilendirici koşullarda yönsel olarak sigma_only altındadır.</w:t>
       </w:r>
     </w:p>
     <w:p>
@@ -10393,7 +10393,7 @@
         <w:suppressAutoHyphens w:val="true"/>
       </w:pPr>
       <w:r>
-        <w:t>Figure 8.10. Deney 5 seed-eşleştirilmiş combined ve regime_only karşılaştırması: bu tanı, combined varyantı içinde sigma_hat kullanımının ne kadar olduğunu sınırlar.</w:t>
+        <w:t>Şekil 8.10. Deney 5 seed-eşleştirilmiş combined ve regime_only karşılaştırması: bu tanı, combined varyantı içinde sigma_hat kullanımının ne kadar olduğunu sınırlar.</w:t>
       </w:r>
     </w:p>
     <w:p>
@@ -10551,7 +10551,7 @@
         <w:suppressAutoHyphens w:val="true"/>
       </w:pPr>
       <w:r>
-        <w:t>Manuskript birden fazla eşleştirilmiş karşılaştırma raporladığı için, tekil marjinal p-değerleri bağımsız bir aile-düzeyi keşif iddiası olarak değil, betimleyici olarak okunmalıdır. Ana sonuç; ana OOS değerlendirmesi, dedektör seçimine karşı sağlamlık, oracle ablasyonları, ödül şekillendirme, yanlış-belirlenim ve sinyal bilgi-değeri tanıları boyunca tekrarlanan desene dayanır.</w:t>
+        <w:t>Manuskript birden fazla eşleştirilmiş karşılaştırma raporladığı için, tekil marjinal p-değerleri bağımsız bir aile-düzeyi keşif iddiası olarak değil, betimleyici olarak okunmalıdır. Ana sonuç; ana OOS değerlendirmesi, dedektör seçimine karşı sağlamlık, oracle ablasyonları, ödül şekillendirme, model yanlış tanımlaması ve sinyal bilgi-değeri tanıları boyunca tekrarlanan desene dayanır.</w:t>
       </w:r>
     </w:p>
     <w:p>
@@ -10568,7 +10568,7 @@
         <w:suppressAutoHyphens w:val="true"/>
       </w:pPr>
       <w:r>
-        <w:t>TOST, eşleştirilmiş bir farkın makul aralığının önceden belirlenmiş pratik-eşdeğerlik bandı içinde kalıp kalmadığını değerlendirir. alpha = 0.05 düzeyinde ilgili eşdeğerlik okuması 90% güven aralığını kullanır. Beş-Varyant Sinyal Ablasyonu, sigma_only ve oracle_full için pratik eşdeğerliği desteklemek amacıyla TOST kullanır; Sinyal Bilgi-Değeri Taraması da eşdeğer olmama ve ortalama ayırt edilemezliği desenlerini incelemek için ilgili eşleştirilmiş testleri kullanır.</w:t>
+        <w:t>TOST, eşleştirilmiş bir fark için makul görülen aralığın önceden belirlenmiş pratik-eşdeğerlik bandının içinde kalıp kalmadığını değerlendirir. alpha = 0.05 düzeyinde bu eşdeğerlik yorumu 90% güven aralığına dayanır. Beş-Varyant Sinyal Ablasyonu, sigma_only ve oracle_full için pratik eşdeğerliği desteklemek amacıyla TOST kullanır; Sinyal Bilgi-Değeri Taraması da eşdeğer olmama ve ortalama bakımından ayırt edilemezlik desenlerini incelemek için ilgili eşleştirilmiş testleri kullanır.</w:t>
       </w:r>
     </w:p>
     <w:p>
@@ -10576,7 +10576,7 @@
         <w:suppressAutoHyphens w:val="true"/>
       </w:pPr>
       <w:r>
-        <w:t>Eşdeğerlik sınırları, evrensel sabitler olarak değil, Sharpe-like metriği için pratik en küçük etki büyüklüğü eşikleri olarak okunmalıdır. Daha geniş +/-0.10 bandı, sorunun oracle rejim bilgisinin yalnızca sigma_hat'e göre pratik olarak anlamlı bir iyileşme yaratıp yaratmadığı olduğu ana beş-varyant ablasyonda kullanılır. Daha dar +/-0.05 sınırları daha dar sağlamlık ya da yanlış-belirlenim kontrollerinde kullanılır. Bu nedenle tez TOST'u tek başına kanıt olarak ele almaz; TOST'u eşleştirilmiş testler, güven aralıkları ve yönsel seed-düzeyi kanıtla birlikte raporlar.</w:t>
+        <w:t>Eşdeğerlik sınırları, evrensel sabitler olarak değil, Sharpe-like metriği için pratik en küçük etki büyüklüğü eşikleri olarak okunmalıdır. Daha geniş +/-0.10 bandı, sorunun oracle rejim bilgisinin yalnızca sigma_hat'e göre pratik olarak anlamlı bir iyileşme yaratıp yaratmadığı olduğu ana beş-varyant ablasyonda kullanılır. Daha dar +/-0.05 sınırları daha dar sağlamlık ya da model yanlış tanımlaması kontrollerinde kullanılır. Bu nedenle tez TOST'u tek başına kanıt olarak ele almaz; TOST'u eşleştirilmiş testler, güven aralıkları ve yönsel seed-düzeyi kanıtla birlikte raporlar.</w:t>
       </w:r>
     </w:p>
     <w:p>
@@ -10602,7 +10602,7 @@
         <w:suppressAutoHyphens w:val="true"/>
       </w:pPr>
       <w:r>
-        <w:t>Test edilen kontrollü sentetik HFMM ortamında, PPO politikası sigma_hat sinyalini zaten gözlemlerken açık kategorik volatilite-rejimi etiketleri güvenilir bir ek performans katkısı sağlamamaktadır. Sonuçlar sinyal fazlalığı (signal redundancy) yorumu ile tutarlıdır.</w:t>
+        <w:t>Test edilen kontrollü sentetik HFMM ortamında, PPO politikası sigma_hat sinyalini zaten gözlemlerken açık kategorik volatilite-rejimi etiketleri tutarlı ve güçlü bir ek fayda sağlamamaktadır. Sonuçlar sinyal fazlalığı (signal redundancy) yorumu ile tutarlıdır.</w:t>
       </w:r>
     </w:p>
     <w:p>
@@ -10618,7 +10618,7 @@
         <w:suppressAutoHyphens w:val="true"/>
       </w:pPr>
       <w:r>
-        <w:t>Bu nedenle kanıt, saf fazlalıktan biraz daha hassas okunmalıdır. Kategorik bir etiket sigma_hat içindeki yararlı bilgiyi yalnızca tekrarlasaydı, combined ve sigma_only varyantlarının yaklaşık olarak ayırt edilemez olması beklenirdi. Ancak birkaç deneyde combined yönsel olarak sigma_only altındadır. Bu desen, sinyal fazlalığına ek olarak kategorik rejim etiketinin bazı senaryolarda performansı hafifçe bozması (mild categorical-channel degradation) ile tutarlıdır: etiket sürekli volatilite tahmininden daha kaba olabilir, gözlem boyutunu artırabilir ya da kontrolle ilgili bilgi eklemeden politika öğrenimiyle olumsuz etkileşebilir. Bu, gözlenen performans deseninin yorumudur; PPO politikasının iç mekanizmasının kanıtı değildir.</w:t>
+        <w:t>Bu nedenle kanıt, yalnızca saf fazlalık olarak değil, biraz daha hassas okunmalıdır. Kategorik bir etiket sigma_hat içindeki yararlı bilgiyi yalnızca tekrarlasaydı, combined ve sigma_only varyantlarının yaklaşık olarak ayırt edilemez olması beklenirdi. Ancak birkaç deneyde combined yönsel olarak sigma_only altında kalmaktadır. Bu desen, sinyal fazlalığına ek olarak kategorik rejim etiketinin bazı senaryolarda performansı hafifçe bozması (mild categorical-channel degradation) ile tutarlıdır: etiket sürekli volatilite tahmininden daha kaba olabilir, gözlem boyutunu artırabilir ya da kontrolle ilgili bilgi eklemeden politika öğrenimiyle olumsuz etkileşebilir. Bu, gözlenen performans sonucuna getirilen temkinli bir yorumdur; PPO politikasının iç mekanizmasının kanıtı değildir.</w:t>
       </w:r>
     </w:p>
     <w:p>
@@ -10635,7 +10635,7 @@
         <w:suppressAutoHyphens w:val="true"/>
       </w:pPr>
       <w:r>
-        <w:t>Sonuç yalnızca p &gt; 0.05 üzerine dayanmaz. Dedektör seçimine karşı sağlamlık, oracle etiketler, TOST eşdeğerliği, ödül-kanalı kontrolleri, hafif yanlış-belirlenim ve sinyal bozulması testleri tarafından desteklenir.</w:t>
+        <w:t>Sonuç yalnızca p &gt; 0.05 üzerine dayanmaz. Dedektör seçimine karşı sağlamlık, oracle etiketler, TOST eşdeğerliği, ödül-kanalı kontrolleri, hafif model yanlış tanımlaması ve sinyal bozulması testleri tarafından desteklenir.</w:t>
       </w:r>
     </w:p>
     <w:p>
@@ -10660,7 +10660,7 @@
         <w:suppressAutoHyphens w:val="true"/>
       </w:pPr>
       <w:r>
-        <w:t>Gerçek limit emir defterleri ana simülatör dışında kalan ek mekanizmalar içerir: kuyruk pozisyonu, yürütme önceliği, ters seçim, emir defteri dengesizliği, daha zengin gecikme etkileri, kümelenmiş ya da kendini-uyaran emir varışları, durağan olmayan likidite ve borsaya özgü işlem maliyeti ile mikro yapı kuralları. Bu mekanizmalar hem volatilite bilgisinin değerini hem de kategorik rejim etiketinin yürütme riskiyle etkileşme biçimini değiştirebilir.</w:t>
+        <w:t>Gerçek limit emir defterleri ana simülatör dışında kalan ek mekanizmalar içerir: kuyruk pozisyonu, yürütme önceliği, ters seçim, emir defteri dengesizliği, daha zengin gecikme etkileri, kümelenmiş ya da kendini-uyaran emir varışları, zamanla değişen likidite koşulları ve borsaya özgü işlem maliyeti ile mikro yapı kuralları. Bu mekanizmalar hem volatilite bilgisinin değerini hem de kategorik rejim etiketinin yürütme riskiyle etkileşme biçimini değiştirebilir.</w:t>
       </w:r>
     </w:p>
     <w:p>
@@ -10992,7 +10992,7 @@
         <w:suppressAutoHyphens w:val="true"/>
       </w:pPr>
       <w:r>
-        <w:t>Daha güçlü rejime bağlı yürütme yanlış-belirlenimini ve daha zengin durağan olmayan likidite ayarlarını değerlendir.</w:t>
+        <w:t>Daha güçlü rejime bağlı yürütme model yanlış tanımlamasını ve piyasa koşullarının zamanla daha belirgin değiştiği likidite ayarlarını değerlendir.</w:t>
       </w:r>
     </w:p>
     <w:p>
@@ -12265,7 +12265,7 @@
               <w:rPr>
                 <w:sz w:val="18"/>
               </w:rPr>
-              <w:t>WP6 süpürmesini çalıştır.</w:t>
+              <w:t>WP6 taramasını çalıştır.</w:t>
             </w:r>
           </w:p>
         </w:tc>
@@ -12313,7 +12313,7 @@
               <w:rPr>
                 <w:sz w:val="18"/>
               </w:rPr>
-              <w:t>WP6 süpürmesini devam ettir.</w:t>
+              <w:t>WP6 taramasını devam ettir.</w:t>
             </w:r>
           </w:p>
         </w:tc>
@@ -12394,7 +12394,7 @@
         <w:suppressAutoHyphens w:val="true"/>
       </w:pPr>
       <w:r>
-        <w:t>Bu şablona uyarlanmış rapor, manuskripti istenen teknik rapor yapısına yeniden düzenlerken tez bulgusunu korur. PPO sentetik HFMM simülatöründe güçlü risk-ayarlı kotasyon davranışı öğrenir; ancak açık kategorik rejim kanalı sigma_hat ötesinde güvenilir bir ek performans katkısı sağlamaz. Sonuç, test edilen kontrollü ortamda sinyal fazlalığı ile tutarlı kanıt olarak en iyi şekilde savunulur.</w:t>
+        <w:t>Bu şablona uyarlanmış rapor, manuskripti istenen teknik rapor yapısına yeniden düzenlerken tez bulgusunu korur. PPO sentetik HFMM simülatöründe güçlü risk-ayarlı kotasyon davranışı öğrenir; ancak açık kategorik rejim kanalı sigma_hat ötesinde tutarlı ve güçlü bir ek fayda sağlamaz. Sonuç, test edilen kontrollü ortamda sinyal fazlalığı ile tutarlı kanıt olarak savunulmalıdır.</w:t>
       </w:r>
     </w:p>
     <w:p>
@@ -12893,7 +12893,7 @@
               <w:rPr>
                 <w:sz w:val="18"/>
               </w:rPr>
-              <w:t>Sinyal denetimi ve süpürmesi</w:t>
+              <w:t>Sinyal denetimi ve taraması</w:t>
             </w:r>
           </w:p>
         </w:tc>

</xml_diff>